<commit_message>
Canvas Original #27: ranked notes item, want-more-of pair, sleep and after-school items; morning-section version (27b)
Co-Authored-By: Claude Opus 5.5 <noreply@anthropic.com>
Claude-Session: https://claude.ai/code/session_012xXYc85fqqQJFJYs8L88CX
</commit_message>
<xml_diff>
--- a/teaching/canvas-originals/co-27-learning-survey-forms-import.docx
+++ b/teaching/canvas-originals/co-27-learning-survey-forms-import.docx
@@ -376,7 +376,7 @@
           <w:sz w:val="22"/>
           <w:szCs w:val="22"/>
         </w:rPr>
-        <w:t xml:space="preserve">6. Which kind of notes help you remember the most?</w:t>
+        <w:t xml:space="preserve">6. Rank the kinds of notes by how well they help you remember. Put your top 3 in order, with 1 as the one that helps most.</w:t>
       </w:r>
     </w:p>
     <w:p>
@@ -744,7 +744,233 @@
           <w:sz w:val="22"/>
           <w:szCs w:val="22"/>
         </w:rPr>
-        <w:t xml:space="preserve">10. Do you learn better from paper or from the iPad?</w:t>
+        <w:t xml:space="preserve">10. Which do you want MORE of? (choose up to 3)</w:t>
+      </w:r>
+    </w:p>
+    <w:p>
+      <w:pPr>
+        <w:spacing w:after="20"/>
+        <w:ind w:left="540"/>
+      </w:pPr>
+      <w:r>
+        <w:rPr>
+          <w:rFonts w:ascii="Calibri" w:cs="Calibri" w:eastAsia="Calibri" w:hAnsi="Calibri"/>
+          <w:sz w:val="22"/>
+          <w:szCs w:val="22"/>
+        </w:rPr>
+        <w:t xml:space="preserve">A. Word card sorts</w:t>
+      </w:r>
+    </w:p>
+    <w:p>
+      <w:pPr>
+        <w:spacing w:after="20"/>
+        <w:ind w:left="540"/>
+      </w:pPr>
+      <w:r>
+        <w:rPr>
+          <w:rFonts w:ascii="Calibri" w:cs="Calibri" w:eastAsia="Calibri" w:hAnsi="Calibri"/>
+          <w:sz w:val="22"/>
+          <w:szCs w:val="22"/>
+        </w:rPr>
+        <w:t xml:space="preserve">B. Drawing cells along with Mr. Schwebach</w:t>
+      </w:r>
+    </w:p>
+    <w:p>
+      <w:pPr>
+        <w:spacing w:after="20"/>
+        <w:ind w:left="540"/>
+      </w:pPr>
+      <w:r>
+        <w:rPr>
+          <w:rFonts w:ascii="Calibri" w:cs="Calibri" w:eastAsia="Calibri" w:hAnsi="Calibri"/>
+          <w:sz w:val="22"/>
+          <w:szCs w:val="22"/>
+        </w:rPr>
+        <w:t xml:space="preserve">C. The Human Membrane</w:t>
+      </w:r>
+    </w:p>
+    <w:p>
+      <w:pPr>
+        <w:spacing w:after="20"/>
+        <w:ind w:left="540"/>
+      </w:pPr>
+      <w:r>
+        <w:rPr>
+          <w:rFonts w:ascii="Calibri" w:cs="Calibri" w:eastAsia="Calibri" w:hAnsi="Calibri"/>
+          <w:sz w:val="22"/>
+          <w:szCs w:val="22"/>
+        </w:rPr>
+        <w:t xml:space="preserve">D. Mystery Cells</w:t>
+      </w:r>
+    </w:p>
+    <w:p>
+      <w:pPr>
+        <w:spacing w:after="20"/>
+        <w:ind w:left="540"/>
+      </w:pPr>
+      <w:r>
+        <w:rPr>
+          <w:rFonts w:ascii="Calibri" w:cs="Calibri" w:eastAsia="Calibri" w:hAnsi="Calibri"/>
+          <w:sz w:val="22"/>
+          <w:szCs w:val="22"/>
+        </w:rPr>
+        <w:t xml:space="preserve">E. The microscope (the seaweed slide)</w:t>
+      </w:r>
+    </w:p>
+    <w:p>
+      <w:pPr>
+        <w:spacing w:after="20"/>
+        <w:ind w:left="540"/>
+      </w:pPr>
+      <w:r>
+        <w:rPr>
+          <w:rFonts w:ascii="Calibri" w:cs="Calibri" w:eastAsia="Calibri" w:hAnsi="Calibri"/>
+          <w:sz w:val="22"/>
+          <w:szCs w:val="22"/>
+        </w:rPr>
+        <w:t xml:space="preserve">F. Practice quizzes on Canvas that show feedback</w:t>
+      </w:r>
+    </w:p>
+    <w:p>
+      <w:pPr>
+        <w:spacing w:after="20"/>
+        <w:ind w:left="540"/>
+      </w:pPr>
+      <w:r>
+        <w:rPr>
+          <w:rFonts w:ascii="Calibri" w:cs="Calibri" w:eastAsia="Calibri" w:hAnsi="Calibri"/>
+          <w:sz w:val="22"/>
+          <w:szCs w:val="22"/>
+        </w:rPr>
+        <w:t xml:space="preserve">G. Crosswords</w:t>
+      </w:r>
+    </w:p>
+    <w:p>
+      <w:pPr>
+        <w:spacing w:after="20"/>
+        <w:ind w:left="540"/>
+      </w:pPr>
+      <w:r>
+        <w:rPr>
+          <w:rFonts w:ascii="Calibri" w:cs="Calibri" w:eastAsia="Calibri" w:hAnsi="Calibri"/>
+          <w:sz w:val="22"/>
+          <w:szCs w:val="22"/>
+        </w:rPr>
+        <w:t xml:space="preserve">H. CER one-pagers</w:t>
+      </w:r>
+    </w:p>
+    <w:p>
+      <w:pPr>
+        <w:spacing w:after="20"/>
+        <w:ind w:left="540"/>
+      </w:pPr>
+      <w:r>
+        <w:rPr>
+          <w:rFonts w:ascii="Calibri" w:cs="Calibri" w:eastAsia="Calibri" w:hAnsi="Calibri"/>
+          <w:sz w:val="22"/>
+          <w:szCs w:val="22"/>
+        </w:rPr>
+        <w:t xml:space="preserve">I. Homework and the warm-up quiz that goes with it</w:t>
+      </w:r>
+    </w:p>
+    <w:p>
+      <w:pPr>
+        <w:spacing w:after="20"/>
+        <w:ind w:left="540"/>
+      </w:pPr>
+      <w:r>
+        <w:rPr>
+          <w:rFonts w:ascii="Calibri" w:cs="Calibri" w:eastAsia="Calibri" w:hAnsi="Calibri"/>
+          <w:sz w:val="22"/>
+          <w:szCs w:val="22"/>
+        </w:rPr>
+        <w:t xml:space="preserve">J. A printed copy of a reading</w:t>
+      </w:r>
+    </w:p>
+    <w:p>
+      <w:pPr>
+        <w:spacing w:after="20"/>
+        <w:ind w:left="540"/>
+      </w:pPr>
+      <w:r>
+        <w:rPr>
+          <w:rFonts w:ascii="Calibri" w:cs="Calibri" w:eastAsia="Calibri" w:hAnsi="Calibri"/>
+          <w:sz w:val="22"/>
+          <w:szCs w:val="22"/>
+        </w:rPr>
+        <w:t xml:space="preserve">K. Gizmos</w:t>
+      </w:r>
+    </w:p>
+    <w:p>
+      <w:pPr>
+        <w:spacing w:after="20"/>
+        <w:ind w:left="540"/>
+      </w:pPr>
+      <w:r>
+        <w:rPr>
+          <w:rFonts w:ascii="Calibri" w:cs="Calibri" w:eastAsia="Calibri" w:hAnsi="Calibri"/>
+          <w:sz w:val="22"/>
+          <w:szCs w:val="22"/>
+        </w:rPr>
+        <w:t xml:space="preserve">L. Mr. Schwebach explaining at the front</w:t>
+      </w:r>
+    </w:p>
+    <w:p>
+      <w:pPr>
+        <w:spacing w:after="20"/>
+        <w:ind w:left="540"/>
+      </w:pPr>
+      <w:r>
+        <w:rPr>
+          <w:rFonts w:ascii="Calibri" w:cs="Calibri" w:eastAsia="Calibri" w:hAnsi="Calibri"/>
+          <w:sz w:val="22"/>
+          <w:szCs w:val="22"/>
+        </w:rPr>
+        <w:t xml:space="preserve">M. Small group work</w:t>
+      </w:r>
+    </w:p>
+    <w:p>
+      <w:pPr>
+        <w:spacing w:after="20"/>
+        <w:ind w:left="540"/>
+      </w:pPr>
+      <w:r>
+        <w:rPr>
+          <w:rFonts w:ascii="Calibri" w:cs="Calibri" w:eastAsia="Calibri" w:hAnsi="Calibri"/>
+          <w:sz w:val="22"/>
+          <w:szCs w:val="22"/>
+        </w:rPr>
+        <w:t xml:space="preserve">N. Labs and hands-on work</w:t>
+      </w:r>
+    </w:p>
+    <w:p>
+      <w:pPr>
+        <w:spacing w:after="60" w:before="120"/>
+      </w:pPr>
+      <w:r>
+        <w:rPr>
+          <w:rFonts w:ascii="Calibri" w:cs="Calibri" w:eastAsia="Calibri" w:hAnsi="Calibri"/>
+          <w:b/>
+          <w:bCs/>
+          <w:sz w:val="22"/>
+          <w:szCs w:val="22"/>
+        </w:rPr>
+        <w:t xml:space="preserve">11. Is there anything else you would like more of that is not on that list? (Optional)</w:t>
+      </w:r>
+    </w:p>
+    <w:p>
+      <w:pPr>
+        <w:spacing w:after="60" w:before="120"/>
+      </w:pPr>
+      <w:r>
+        <w:rPr>
+          <w:rFonts w:ascii="Calibri" w:cs="Calibri" w:eastAsia="Calibri" w:hAnsi="Calibri"/>
+          <w:b/>
+          <w:bCs/>
+          <w:sz w:val="22"/>
+          <w:szCs w:val="22"/>
+        </w:rPr>
+        <w:t xml:space="preserve">12. Do you learn better from paper or from the iPad?</w:t>
       </w:r>
     </w:p>
     <w:p>
@@ -815,7 +1041,7 @@
           <w:sz w:val="22"/>
           <w:szCs w:val="22"/>
         </w:rPr>
-        <w:t xml:space="preserve">11. How easy is it to find what we are doing today on Canvas (the Start Here page)?</w:t>
+        <w:t xml:space="preserve">13. How easy is it to find what we are doing today on Canvas (the Start Here page)?</w:t>
       </w:r>
     </w:p>
     <w:p>
@@ -886,7 +1112,7 @@
           <w:sz w:val="22"/>
           <w:szCs w:val="22"/>
         </w:rPr>
-        <w:t xml:space="preserve">12. After a practice quiz on Canvas, do you read the feedback on the questions you missed?</w:t>
+        <w:t xml:space="preserve">14. After a practice quiz on Canvas, do you read the feedback on the questions you missed?</w:t>
       </w:r>
     </w:p>
     <w:p>
@@ -957,7 +1183,7 @@
           <w:sz w:val="22"/>
           <w:szCs w:val="22"/>
         </w:rPr>
-        <w:t xml:space="preserve">13. When you get stuck, what do you usually do?</w:t>
+        <w:t xml:space="preserve">15. When you get stuck, what do you usually do?</w:t>
       </w:r>
     </w:p>
     <w:p>
@@ -1056,7 +1282,7 @@
           <w:sz w:val="22"/>
           <w:szCs w:val="22"/>
         </w:rPr>
-        <w:t xml:space="preserve">14. How do you feel about the pace of this advanced class?</w:t>
+        <w:t xml:space="preserve">16. How do you feel about the pace of this advanced class?</w:t>
       </w:r>
     </w:p>
     <w:p>
@@ -1154,7 +1380,7 @@
           <w:sz w:val="22"/>
           <w:szCs w:val="22"/>
         </w:rPr>
-        <w:t xml:space="preserve">15. When Mr. Schwebach is teaching from the front, I follow best when the room is:</w:t>
+        <w:t xml:space="preserve">17. When Mr. Schwebach is teaching from the front, I follow best when the room is:</w:t>
       </w:r>
     </w:p>
     <w:p>
@@ -1211,7 +1437,7 @@
           <w:sz w:val="22"/>
           <w:szCs w:val="22"/>
         </w:rPr>
-        <w:t xml:space="preserve">16. How often does someone talk over the lesson in this class?</w:t>
+        <w:t xml:space="preserve">18. How often does someone talk over the lesson in this class?</w:t>
       </w:r>
     </w:p>
     <w:p>
@@ -1282,7 +1508,7 @@
           <w:sz w:val="22"/>
           <w:szCs w:val="22"/>
         </w:rPr>
-        <w:t xml:space="preserve">17. Be honest: in a typical class, how many times do you talk while someone else has the floor?</w:t>
+        <w:t xml:space="preserve">19. Be honest: in a typical class, how many times do you talk while someone else has the floor?</w:t>
       </w:r>
     </w:p>
     <w:p>
@@ -1353,7 +1579,7 @@
           <w:sz w:val="22"/>
           <w:szCs w:val="22"/>
         </w:rPr>
-        <w:t xml:space="preserve">18. When you talk during the lesson, it is usually because... (choose all that apply)</w:t>
+        <w:t xml:space="preserve">20. When you talk during the lesson, it is usually because... (choose all that apply)</w:t>
       </w:r>
     </w:p>
     <w:p>
@@ -1466,7 +1692,7 @@
           <w:sz w:val="22"/>
           <w:szCs w:val="22"/>
         </w:rPr>
-        <w:t xml:space="preserve">19. What would help you hold a question until the right moment?</w:t>
+        <w:t xml:space="preserve">21. What would help you hold a question until the right moment?</w:t>
       </w:r>
     </w:p>
     <w:p>
@@ -1551,7 +1777,7 @@
           <w:sz w:val="22"/>
           <w:szCs w:val="22"/>
         </w:rPr>
-        <w:t xml:space="preserve">20. When is the best time for you to talk with Mr. Schwebach one-on-one?</w:t>
+        <w:t xml:space="preserve">22. When is the best time for you to talk with Mr. Schwebach one-on-one?</w:t>
       </w:r>
     </w:p>
     <w:p>
@@ -1636,7 +1862,7 @@
           <w:sz w:val="22"/>
           <w:szCs w:val="22"/>
         </w:rPr>
-        <w:t xml:space="preserve">21. What helps your small group get work done? (choose all that apply)</w:t>
+        <w:t xml:space="preserve">23. What helps your small group get work done? (choose all that apply)</w:t>
       </w:r>
     </w:p>
     <w:p>
@@ -1735,7 +1961,7 @@
           <w:sz w:val="22"/>
           <w:szCs w:val="22"/>
         </w:rPr>
-        <w:t xml:space="preserve">22. In a group, which role do you usually take?</w:t>
+        <w:t xml:space="preserve">24. In a group, which role do you usually take?</w:t>
       </w:r>
     </w:p>
     <w:p>
@@ -1834,7 +2060,7 @@
           <w:sz w:val="22"/>
           <w:szCs w:val="22"/>
         </w:rPr>
-        <w:t xml:space="preserve">23. If your group stays on task, would you like more say in how it works (choosing roles, the order of tasks, how to show what you learned)?</w:t>
+        <w:t xml:space="preserve">25. If your group stays on task, would you like more say in how it works (choosing roles, the order of tasks, how to show what you learned)?</w:t>
       </w:r>
     </w:p>
     <w:p>
@@ -1891,7 +2117,7 @@
           <w:sz w:val="22"/>
           <w:szCs w:val="22"/>
         </w:rPr>
-        <w:t xml:space="preserve">24. By 7th block, how is your energy?</w:t>
+        <w:t xml:space="preserve">26. By the time this class meets, how is your energy?</w:t>
       </w:r>
     </w:p>
     <w:p>
@@ -1962,7 +2188,177 @@
           <w:sz w:val="22"/>
           <w:szCs w:val="22"/>
         </w:rPr>
-        <w:t xml:space="preserve">25. When you are tired, what helps you most? (choose all that apply) A quiet break with your head down is allowed. Talking over the lesson is not.</w:t>
+        <w:t xml:space="preserve">27. On a school night, about how many hours do you usually sleep?</w:t>
+      </w:r>
+    </w:p>
+    <w:p>
+      <w:pPr>
+        <w:spacing w:after="20"/>
+        <w:ind w:left="540"/>
+      </w:pPr>
+      <w:r>
+        <w:rPr>
+          <w:rFonts w:ascii="Calibri" w:cs="Calibri" w:eastAsia="Calibri" w:hAnsi="Calibri"/>
+          <w:sz w:val="22"/>
+          <w:szCs w:val="22"/>
+        </w:rPr>
+        <w:t xml:space="preserve">A. Less than 6</w:t>
+      </w:r>
+    </w:p>
+    <w:p>
+      <w:pPr>
+        <w:spacing w:after="20"/>
+        <w:ind w:left="540"/>
+      </w:pPr>
+      <w:r>
+        <w:rPr>
+          <w:rFonts w:ascii="Calibri" w:cs="Calibri" w:eastAsia="Calibri" w:hAnsi="Calibri"/>
+          <w:sz w:val="22"/>
+          <w:szCs w:val="22"/>
+        </w:rPr>
+        <w:t xml:space="preserve">B. 6 to 7</w:t>
+      </w:r>
+    </w:p>
+    <w:p>
+      <w:pPr>
+        <w:spacing w:after="20"/>
+        <w:ind w:left="540"/>
+      </w:pPr>
+      <w:r>
+        <w:rPr>
+          <w:rFonts w:ascii="Calibri" w:cs="Calibri" w:eastAsia="Calibri" w:hAnsi="Calibri"/>
+          <w:sz w:val="22"/>
+          <w:szCs w:val="22"/>
+        </w:rPr>
+        <w:t xml:space="preserve">C. 7 to 8</w:t>
+      </w:r>
+    </w:p>
+    <w:p>
+      <w:pPr>
+        <w:spacing w:after="20"/>
+        <w:ind w:left="540"/>
+      </w:pPr>
+      <w:r>
+        <w:rPr>
+          <w:rFonts w:ascii="Calibri" w:cs="Calibri" w:eastAsia="Calibri" w:hAnsi="Calibri"/>
+          <w:sz w:val="22"/>
+          <w:szCs w:val="22"/>
+        </w:rPr>
+        <w:t xml:space="preserve">D. 8 to 9</w:t>
+      </w:r>
+    </w:p>
+    <w:p>
+      <w:pPr>
+        <w:spacing w:after="20"/>
+        <w:ind w:left="540"/>
+      </w:pPr>
+      <w:r>
+        <w:rPr>
+          <w:rFonts w:ascii="Calibri" w:cs="Calibri" w:eastAsia="Calibri" w:hAnsi="Calibri"/>
+          <w:sz w:val="22"/>
+          <w:szCs w:val="22"/>
+        </w:rPr>
+        <w:t xml:space="preserve">E. More than 9</w:t>
+      </w:r>
+    </w:p>
+    <w:p>
+      <w:pPr>
+        <w:spacing w:after="60" w:before="120"/>
+      </w:pPr>
+      <w:r>
+        <w:rPr>
+          <w:rFonts w:ascii="Calibri" w:cs="Calibri" w:eastAsia="Calibri" w:hAnsi="Calibri"/>
+          <w:b/>
+          <w:bCs/>
+          <w:sz w:val="22"/>
+          <w:szCs w:val="22"/>
+        </w:rPr>
+        <w:t xml:space="preserve">28. On a typical school day, how many hours do you spend after school on a sport, job, club or caring for family?</w:t>
+      </w:r>
+    </w:p>
+    <w:p>
+      <w:pPr>
+        <w:spacing w:after="20"/>
+        <w:ind w:left="540"/>
+      </w:pPr>
+      <w:r>
+        <w:rPr>
+          <w:rFonts w:ascii="Calibri" w:cs="Calibri" w:eastAsia="Calibri" w:hAnsi="Calibri"/>
+          <w:sz w:val="22"/>
+          <w:szCs w:val="22"/>
+        </w:rPr>
+        <w:t xml:space="preserve">A. None</w:t>
+      </w:r>
+    </w:p>
+    <w:p>
+      <w:pPr>
+        <w:spacing w:after="20"/>
+        <w:ind w:left="540"/>
+      </w:pPr>
+      <w:r>
+        <w:rPr>
+          <w:rFonts w:ascii="Calibri" w:cs="Calibri" w:eastAsia="Calibri" w:hAnsi="Calibri"/>
+          <w:sz w:val="22"/>
+          <w:szCs w:val="22"/>
+        </w:rPr>
+        <w:t xml:space="preserve">B. Less than 1 hour</w:t>
+      </w:r>
+    </w:p>
+    <w:p>
+      <w:pPr>
+        <w:spacing w:after="20"/>
+        <w:ind w:left="540"/>
+      </w:pPr>
+      <w:r>
+        <w:rPr>
+          <w:rFonts w:ascii="Calibri" w:cs="Calibri" w:eastAsia="Calibri" w:hAnsi="Calibri"/>
+          <w:sz w:val="22"/>
+          <w:szCs w:val="22"/>
+        </w:rPr>
+        <w:t xml:space="preserve">C. 1 to 2 hours</w:t>
+      </w:r>
+    </w:p>
+    <w:p>
+      <w:pPr>
+        <w:spacing w:after="20"/>
+        <w:ind w:left="540"/>
+      </w:pPr>
+      <w:r>
+        <w:rPr>
+          <w:rFonts w:ascii="Calibri" w:cs="Calibri" w:eastAsia="Calibri" w:hAnsi="Calibri"/>
+          <w:sz w:val="22"/>
+          <w:szCs w:val="22"/>
+        </w:rPr>
+        <w:t xml:space="preserve">D. 2 to 3 hours</w:t>
+      </w:r>
+    </w:p>
+    <w:p>
+      <w:pPr>
+        <w:spacing w:after="20"/>
+        <w:ind w:left="540"/>
+      </w:pPr>
+      <w:r>
+        <w:rPr>
+          <w:rFonts w:ascii="Calibri" w:cs="Calibri" w:eastAsia="Calibri" w:hAnsi="Calibri"/>
+          <w:sz w:val="22"/>
+          <w:szCs w:val="22"/>
+        </w:rPr>
+        <w:t xml:space="preserve">E. More than 3 hours</w:t>
+      </w:r>
+    </w:p>
+    <w:p>
+      <w:pPr>
+        <w:spacing w:after="60" w:before="120"/>
+      </w:pPr>
+      <w:r>
+        <w:rPr>
+          <w:rFonts w:ascii="Calibri" w:cs="Calibri" w:eastAsia="Calibri" w:hAnsi="Calibri"/>
+          <w:b/>
+          <w:bCs/>
+          <w:sz w:val="22"/>
+          <w:szCs w:val="22"/>
+        </w:rPr>
+        <w:t xml:space="preserve">29. When you are tired, what helps you most? (choose all that apply) A quiet break with your head down is allowed. Talking over the lesson is not.</w:t>
       </w:r>
     </w:p>
     <w:p>
@@ -2061,37 +2457,37 @@
           <w:sz w:val="22"/>
           <w:szCs w:val="22"/>
         </w:rPr>
-        <w:t xml:space="preserve">26. What is one thing classmates could do to make this room better for learning? Do not name anyone.</w:t>
-      </w:r>
-    </w:p>
-    <w:p>
-      <w:pPr>
-        <w:spacing w:after="60" w:before="120"/>
-      </w:pPr>
-      <w:r>
-        <w:rPr>
-          <w:rFonts w:ascii="Calibri" w:cs="Calibri" w:eastAsia="Calibri" w:hAnsi="Calibri"/>
-          <w:b/>
-          <w:bCs/>
-          <w:sz w:val="22"/>
-          <w:szCs w:val="22"/>
-        </w:rPr>
-        <w:t xml:space="preserve">27. What is one thing YOU will do to make this room better for learning?</w:t>
-      </w:r>
-    </w:p>
-    <w:p>
-      <w:pPr>
-        <w:spacing w:after="60" w:before="120"/>
-      </w:pPr>
-      <w:r>
-        <w:rPr>
-          <w:rFonts w:ascii="Calibri" w:cs="Calibri" w:eastAsia="Calibri" w:hAnsi="Calibri"/>
-          <w:b/>
-          <w:bCs/>
-          <w:sz w:val="22"/>
-          <w:szCs w:val="22"/>
-        </w:rPr>
-        <w:t xml:space="preserve">28. To learn in here, I need Mr. Schwebach to...</w:t>
+        <w:t xml:space="preserve">30. What is one thing classmates could do to make this room better for learning? Do not name anyone.</w:t>
+      </w:r>
+    </w:p>
+    <w:p>
+      <w:pPr>
+        <w:spacing w:after="60" w:before="120"/>
+      </w:pPr>
+      <w:r>
+        <w:rPr>
+          <w:rFonts w:ascii="Calibri" w:cs="Calibri" w:eastAsia="Calibri" w:hAnsi="Calibri"/>
+          <w:b/>
+          <w:bCs/>
+          <w:sz w:val="22"/>
+          <w:szCs w:val="22"/>
+        </w:rPr>
+        <w:t xml:space="preserve">31. What is one thing YOU will do to make this room better for learning?</w:t>
+      </w:r>
+    </w:p>
+    <w:p>
+      <w:pPr>
+        <w:spacing w:after="60" w:before="120"/>
+      </w:pPr>
+      <w:r>
+        <w:rPr>
+          <w:rFonts w:ascii="Calibri" w:cs="Calibri" w:eastAsia="Calibri" w:hAnsi="Calibri"/>
+          <w:b/>
+          <w:bCs/>
+          <w:sz w:val="22"/>
+          <w:szCs w:val="22"/>
+        </w:rPr>
+        <w:t xml:space="preserve">32. To learn in here, I need Mr. Schwebach to...</w:t>
       </w:r>
     </w:p>
     <w:p>
@@ -2133,7 +2529,7 @@
           <w:sz w:val="22"/>
           <w:szCs w:val="22"/>
         </w:rPr>
-        <w:t xml:space="preserve">29. Does the Start Here page help you know which packet page to work on?</w:t>
+        <w:t xml:space="preserve">33. Does the Start Here page help you know which packet page to work on?</w:t>
       </w:r>
     </w:p>
     <w:p>
@@ -2218,7 +2614,7 @@
           <w:sz w:val="22"/>
           <w:szCs w:val="22"/>
         </w:rPr>
-        <w:t xml:space="preserve">30. Does the Start Here page help you see where the lesson is going (what comes next and what it builds toward)?</w:t>
+        <w:t xml:space="preserve">34. Does the Start Here page help you see where the lesson is going (what comes next and what it builds toward)?</w:t>
       </w:r>
     </w:p>
     <w:p>
@@ -2289,7 +2685,7 @@
           <w:sz w:val="22"/>
           <w:szCs w:val="22"/>
         </w:rPr>
-        <w:t xml:space="preserve">31. In Unit 2 (cells), the slides, the packet and Canvas lined up with each other better than in Unit 1. Do you agree?</w:t>
+        <w:t xml:space="preserve">35. In Unit 2 (cells), the slides, the packet and Canvas lined up with each other better than in Unit 1. Do you agree?</w:t>
       </w:r>
     </w:p>
     <w:p>
@@ -2374,7 +2770,7 @@
           <w:sz w:val="22"/>
           <w:szCs w:val="22"/>
         </w:rPr>
-        <w:t xml:space="preserve">32. People learn in different ways. Does having each step on Canvas let classmates who learn differently from you work through the content their own way?</w:t>
+        <w:t xml:space="preserve">36. People learn in different ways. Does having each step on Canvas let classmates who learn differently from you work through the content their own way?</w:t>
       </w:r>
     </w:p>
     <w:p>
@@ -2445,7 +2841,7 @@
           <w:sz w:val="22"/>
           <w:szCs w:val="22"/>
         </w:rPr>
-        <w:t xml:space="preserve">33. Before today, did you know the county is requiring classes to use these new technology practices?</w:t>
+        <w:t xml:space="preserve">37. Before today, did you know the county is requiring classes to use these new technology practices?</w:t>
       </w:r>
     </w:p>
     <w:p>
@@ -2502,7 +2898,7 @@
           <w:sz w:val="22"/>
           <w:szCs w:val="22"/>
         </w:rPr>
-        <w:t xml:space="preserve">34. You can always email Mr. Schwebach an idea for the class instead of saying it out loud during the lesson. How likely are you to do that?</w:t>
+        <w:t xml:space="preserve">38. You can always email Mr. Schwebach an idea for the class instead of saying it out loud during the lesson. How likely are you to do that?</w:t>
       </w:r>
     </w:p>
     <w:p>
@@ -2600,7 +2996,7 @@
           <w:sz w:val="22"/>
           <w:szCs w:val="22"/>
         </w:rPr>
-        <w:t xml:space="preserve">35. Have you seen another student cheating in this class (copying, sharing answers, using a phone or AI on a quiz or test)?</w:t>
+        <w:t xml:space="preserve">39. Have you seen another student cheating in this class (copying, sharing answers, using a phone or AI on a quiz or test)?</w:t>
       </w:r>
     </w:p>
     <w:p>
@@ -2671,7 +3067,7 @@
           <w:sz w:val="22"/>
           <w:szCs w:val="22"/>
         </w:rPr>
-        <w:t xml:space="preserve">36. Are phones being used in class where Mr. Schwebach cannot see them because of how the room is set up?</w:t>
+        <w:t xml:space="preserve">40. Are phones being used in class where Mr. Schwebach cannot see them because of how the room is set up?</w:t>
       </w:r>
     </w:p>
     <w:p>
@@ -2756,7 +3152,7 @@
           <w:sz w:val="22"/>
           <w:szCs w:val="22"/>
         </w:rPr>
-        <w:t xml:space="preserve">37. Where in the room is it hardest for Mr. Schwebach to see what is going on?</w:t>
+        <w:t xml:space="preserve">41. Where in the room is it hardest for Mr. Schwebach to see what is going on?</w:t>
       </w:r>
     </w:p>
     <w:p>
@@ -2853,7 +3249,7 @@
           <w:sz w:val="22"/>
           <w:szCs w:val="22"/>
         </w:rPr>
-        <w:t xml:space="preserve">38. What is the best way for Mr. Schwebach to share good news about you with your family?</w:t>
+        <w:t xml:space="preserve">42. What is the best way for Mr. Schwebach to share good news about you with your family?</w:t>
       </w:r>
     </w:p>
     <w:p>
@@ -2924,7 +3320,7 @@
           <w:sz w:val="22"/>
           <w:szCs w:val="22"/>
         </w:rPr>
-        <w:t xml:space="preserve">39. Our class agreement has four steps if it gets broken. Which one would help you reset fastest if you got off track?</w:t>
+        <w:t xml:space="preserve">43. Our class agreement has four steps if it gets broken. Which one would help you reset fastest if you got off track?</w:t>
       </w:r>
     </w:p>
     <w:p>
@@ -3009,7 +3405,7 @@
           <w:sz w:val="22"/>
           <w:szCs w:val="22"/>
         </w:rPr>
-        <w:t xml:space="preserve">40. Is there anything Mr. Schwebach should know that would help you learn in this class? (Optional)</w:t>
+        <w:t xml:space="preserve">44. Is there anything Mr. Schwebach should know that would help you learn in this class? (Optional)</w:t>
       </w:r>
     </w:p>
     <w:sectPr>

</xml_diff>